<commit_message>
fixing existing erros in app
</commit_message>
<xml_diff>
--- a/Podanie o uznanie wykonanej pracy jako praktyki z nazwiskiem dziekana(2)_en.docx
+++ b/Podanie o uznanie wykonanej pracy jako praktyki z nazwiskiem dziekana(2)_en.docx
@@ -1,6 +1,6 @@
 
 <file path=word/document.xml><?xml version="1.0" encoding="utf-8"?>
-<w:document xmlns:wpc="http://schemas.microsoft.com/office/word/2010/wordprocessingCanvas" xmlns:cx="http://schemas.microsoft.com/office/drawing/2014/chartex" xmlns:cx1="http://schemas.microsoft.com/office/drawing/2015/9/8/chartex" xmlns:cx2="http://schemas.microsoft.com/office/drawing/2015/10/21/chartex" xmlns:cx3="http://schemas.microsoft.com/office/drawing/2016/5/9/chartex" xmlns:cx4="http://schemas.microsoft.com/office/drawing/2016/5/10/chartex" xmlns:cx5="http://schemas.microsoft.com/office/drawing/2016/5/11/chartex" xmlns:cx6="http://schemas.microsoft.com/office/drawing/2016/5/12/chartex" xmlns:cx7="http://schemas.microsoft.com/office/drawing/2016/5/13/chartex" xmlns:cx8="http://schemas.microsoft.com/office/drawing/2016/5/14/chartex" xmlns:mc="http://schemas.openxmlformats.org/markup-compatibility/2006" xmlns:aink="http://schemas.microsoft.com/office/drawing/2016/ink" xmlns:am3d="http://schemas.microsoft.com/office/drawing/2017/model3d" xmlns:o="urn:schemas-microsoft-com:office:office" xmlns:oel="http://schemas.microsoft.com/office/2019/extlst" xmlns:r="http://schemas.openxmlformats.org/officeDocument/2006/relationships" xmlns:m="http://schemas.openxmlformats.org/officeDocument/2006/math" xmlns:v="urn:schemas-microsoft-com:vml" xmlns:wp14="http://schemas.microsoft.com/office/word/2010/wordprocessingDrawing" xmlns:wp="http://schemas.openxmlformats.org/drawingml/2006/wordprocessingDrawing" xmlns:w10="urn:schemas-microsoft-com:office:word" xmlns:w="http://schemas.openxmlformats.org/wordprocessingml/2006/main" xmlns:w14="http://schemas.microsoft.com/office/word/2010/wordml" xmlns:w15="http://schemas.microsoft.com/office/word/2012/wordml" xmlns:w16cex="http://schemas.microsoft.com/office/word/2018/wordml/cex" xmlns:w16cid="http://schemas.microsoft.com/office/word/2016/wordml/cid" xmlns:w16="http://schemas.microsoft.com/office/word/2018/wordml" xmlns:w16du="http://schemas.microsoft.com/office/word/2023/wordml/word16du" xmlns:w16sdtdh="http://schemas.microsoft.com/office/word/2020/wordml/sdtdatahash" xmlns:w16sdtfl="http://schemas.microsoft.com/office/word/2024/wordml/sdtformatlock" xmlns:w16se="http://schemas.microsoft.com/office/word/2015/wordml/symex" xmlns:wpg="http://schemas.microsoft.com/office/word/2010/wordprocessingGroup" xmlns:wpi="http://schemas.microsoft.com/office/word/2010/wordprocessingInk" xmlns:wne="http://schemas.microsoft.com/office/word/2006/wordml" xmlns:wps="http://schemas.microsoft.com/office/word/2010/wordprocessingShape" mc:Ignorable="w14 w15 w16se w16cid w16 w16cex w16sdtdh w16sdtfl w16du wp14">
+<w:document xmlns:wpc="http://schemas.microsoft.com/office/word/2010/wordprocessingCanvas" xmlns:mc="http://schemas.openxmlformats.org/markup-compatibility/2006" xmlns:o="urn:schemas-microsoft-com:office:office" xmlns:r="http://schemas.openxmlformats.org/officeDocument/2006/relationships" xmlns:m="http://schemas.openxmlformats.org/officeDocument/2006/math" xmlns:v="urn:schemas-microsoft-com:vml" xmlns:wp14="http://schemas.microsoft.com/office/word/2010/wordprocessingDrawing" xmlns:wp="http://schemas.openxmlformats.org/drawingml/2006/wordprocessingDrawing" xmlns:w10="urn:schemas-microsoft-com:office:word" xmlns:w="http://schemas.openxmlformats.org/wordprocessingml/2006/main" xmlns:w14="http://schemas.microsoft.com/office/word/2010/wordml" xmlns:w15="http://schemas.microsoft.com/office/word/2012/wordml" xmlns:wpg="http://schemas.microsoft.com/office/word/2010/wordprocessingGroup" xmlns:wpi="http://schemas.microsoft.com/office/word/2010/wordprocessingInk" xmlns:wne="http://schemas.microsoft.com/office/word/2006/wordml" xmlns:wps="http://schemas.microsoft.com/office/word/2010/wordprocessingShape" mc:Ignorable="w14 w15 wp14">
   <w:body>
     <w:tbl>
       <w:tblPr>
@@ -26,6 +26,7 @@
         <w:tc>
           <w:tcPr>
             <w:tcW w:w="5100" w:type="dxa"/>
+            <w:shd w:val="clear" w:color="auto" w:fill="auto"/>
             <w:tcMar>
               <w:top w:w="55" w:type="dxa"/>
               <w:left w:w="55" w:type="dxa"/>
@@ -40,13 +41,15 @@
                 <w:tab w:val="right" w:leader="dot" w:pos="4535"/>
               </w:tabs>
             </w:pPr>
+            <w:bookmarkStart w:id="0" w:name="_GoBack"/>
+            <w:bookmarkEnd w:id="0"/>
             <w:proofErr w:type="spellStart"/>
             <w:r>
-              <w:t>Bialystok</w:t>
+              <w:t>Белокожный</w:t>
             </w:r>
             <w:proofErr w:type="spellEnd"/>
             <w:r>
-              <w:t>, ...................................................................</w:t>
+              <w:t>, ...................................</w:t>
             </w:r>
           </w:p>
           <w:p>
@@ -128,7 +131,29 @@
                 <w:sz w:val="16"/>
                 <w:szCs w:val="16"/>
               </w:rPr>
-              <w:t>Name</w:t>
+              <w:t>Имя</w:t>
+            </w:r>
+            <w:proofErr w:type="spellEnd"/>
+            <w:r>
+              <w:rPr>
+                <w:i/>
+                <w:iCs/>
+                <w:color w:val="000000"/>
+                <w:sz w:val="16"/>
+                <w:szCs w:val="16"/>
+              </w:rPr>
+              <w:t xml:space="preserve"> и </w:t>
+            </w:r>
+            <w:proofErr w:type="spellStart"/>
+            <w:r>
+              <w:rPr>
+                <w:i/>
+                <w:iCs/>
+                <w:color w:val="000000"/>
+                <w:sz w:val="16"/>
+                <w:szCs w:val="16"/>
+              </w:rPr>
+              <w:t>фамилию</w:t>
             </w:r>
             <w:proofErr w:type="spellEnd"/>
           </w:p>
@@ -179,6 +204,7 @@
                 <w:szCs w:val="16"/>
               </w:rPr>
             </w:pPr>
+            <w:proofErr w:type="spellStart"/>
             <w:r>
               <w:rPr>
                 <w:i/>
@@ -187,8 +213,31 @@
                 <w:sz w:val="16"/>
                 <w:szCs w:val="16"/>
               </w:rPr>
-              <w:t>Album No</w:t>
+              <w:t>Номер</w:t>
             </w:r>
+            <w:proofErr w:type="spellEnd"/>
+            <w:r>
+              <w:rPr>
+                <w:i/>
+                <w:iCs/>
+                <w:color w:val="000000"/>
+                <w:sz w:val="16"/>
+                <w:szCs w:val="16"/>
+              </w:rPr>
+              <w:t xml:space="preserve"> </w:t>
+            </w:r>
+            <w:proofErr w:type="spellStart"/>
+            <w:r>
+              <w:rPr>
+                <w:i/>
+                <w:iCs/>
+                <w:color w:val="000000"/>
+                <w:sz w:val="16"/>
+                <w:szCs w:val="16"/>
+              </w:rPr>
+              <w:t>альбома</w:t>
+            </w:r>
+            <w:proofErr w:type="spellEnd"/>
           </w:p>
           <w:p>
             <w:pPr>
@@ -250,7 +299,7 @@
                 <w:sz w:val="16"/>
                 <w:szCs w:val="16"/>
               </w:rPr>
-              <w:t>Direction</w:t>
+              <w:t>Уровень</w:t>
             </w:r>
             <w:proofErr w:type="spellEnd"/>
             <w:r>
@@ -261,7 +310,7 @@
                 <w:sz w:val="16"/>
                 <w:szCs w:val="16"/>
               </w:rPr>
-              <w:t xml:space="preserve"> and </w:t>
+              <w:t xml:space="preserve"> и </w:t>
             </w:r>
             <w:proofErr w:type="spellStart"/>
             <w:r>
@@ -272,7 +321,7 @@
                 <w:sz w:val="16"/>
                 <w:szCs w:val="16"/>
               </w:rPr>
-              <w:t>degree</w:t>
+              <w:t>направление</w:t>
             </w:r>
             <w:proofErr w:type="spellEnd"/>
             <w:r>
@@ -283,7 +332,7 @@
                 <w:sz w:val="16"/>
                 <w:szCs w:val="16"/>
               </w:rPr>
-              <w:t xml:space="preserve"> of </w:t>
+              <w:t xml:space="preserve"> </w:t>
             </w:r>
             <w:proofErr w:type="spellStart"/>
             <w:r>
@@ -294,7 +343,7 @@
                 <w:sz w:val="16"/>
                 <w:szCs w:val="16"/>
               </w:rPr>
-              <w:t>study</w:t>
+              <w:t>обучения</w:t>
             </w:r>
             <w:proofErr w:type="spellEnd"/>
           </w:p>
@@ -335,7 +384,7 @@
                 <w:sz w:val="20"/>
                 <w:szCs w:val="20"/>
               </w:rPr>
-              <w:t>fixed</w:t>
+              <w:t>стационарные</w:t>
             </w:r>
             <w:proofErr w:type="spellEnd"/>
             <w:r>
@@ -357,7 +406,7 @@
                 <w:sz w:val="20"/>
                 <w:szCs w:val="20"/>
               </w:rPr>
-              <w:t>fixed</w:t>
+              <w:t>нестационарные</w:t>
             </w:r>
             <w:proofErr w:type="spellEnd"/>
             <w:r>
@@ -379,7 +428,7 @@
                 <w:sz w:val="20"/>
                 <w:szCs w:val="20"/>
               </w:rPr>
-              <w:t>studios</w:t>
+              <w:t>исследования</w:t>
             </w:r>
             <w:proofErr w:type="spellEnd"/>
           </w:p>
@@ -449,7 +498,7 @@
                 <w:sz w:val="16"/>
                 <w:szCs w:val="16"/>
               </w:rPr>
-              <w:t>Study</w:t>
+              <w:t>Цикл</w:t>
             </w:r>
             <w:proofErr w:type="spellEnd"/>
             <w:r>
@@ -460,8 +509,20 @@
                 <w:sz w:val="16"/>
                 <w:szCs w:val="16"/>
               </w:rPr>
-              <w:t xml:space="preserve"> cycle</w:t>
+              <w:t xml:space="preserve"> </w:t>
             </w:r>
+            <w:proofErr w:type="spellStart"/>
+            <w:r>
+              <w:rPr>
+                <w:i/>
+                <w:iCs/>
+                <w:color w:val="000000"/>
+                <w:sz w:val="16"/>
+                <w:szCs w:val="16"/>
+              </w:rPr>
+              <w:t>обучения</w:t>
+            </w:r>
+            <w:proofErr w:type="spellEnd"/>
           </w:p>
           <w:p>
             <w:pPr>
@@ -491,6 +552,7 @@
         <w:tc>
           <w:tcPr>
             <w:tcW w:w="3971" w:type="dxa"/>
+            <w:shd w:val="clear" w:color="auto" w:fill="auto"/>
             <w:tcMar>
               <w:top w:w="55" w:type="dxa"/>
               <w:left w:w="55" w:type="dxa"/>
@@ -527,12 +589,14 @@
           <w:rStyle w:val="StrongEmphasis"/>
         </w:rPr>
       </w:pPr>
+      <w:proofErr w:type="spellStart"/>
       <w:r>
         <w:rPr>
           <w:rStyle w:val="StrongEmphasis"/>
         </w:rPr>
-        <w:t>Dean</w:t>
-      </w:r>
+        <w:t>Деканат</w:t>
+      </w:r>
+      <w:proofErr w:type="spellEnd"/>
     </w:p>
     <w:p>
       <w:pPr>
@@ -547,21 +611,21 @@
         <w:rPr>
           <w:rStyle w:val="StrongEmphasis"/>
         </w:rPr>
-        <w:t>Computer</w:t>
+        <w:t>Отдел</w:t>
       </w:r>
       <w:proofErr w:type="spellEnd"/>
       <w:r>
         <w:rPr>
           <w:rStyle w:val="StrongEmphasis"/>
         </w:rPr>
-        <w:t xml:space="preserve"> Science </w:t>
+        <w:t xml:space="preserve"> </w:t>
       </w:r>
       <w:proofErr w:type="spellStart"/>
       <w:r>
         <w:rPr>
           <w:rStyle w:val="StrongEmphasis"/>
         </w:rPr>
-        <w:t>Department</w:t>
+        <w:t>информатики</w:t>
       </w:r>
       <w:proofErr w:type="spellEnd"/>
     </w:p>
@@ -572,25 +636,61 @@
           <w:rStyle w:val="StrongEmphasis"/>
         </w:rPr>
       </w:pPr>
+      <w:proofErr w:type="spellStart"/>
       <w:r>
         <w:rPr>
           <w:rStyle w:val="StrongEmphasis"/>
         </w:rPr>
-        <w:t xml:space="preserve">Dr Dorota </w:t>
-      </w:r>
-      <w:proofErr w:type="spellStart"/>
+        <w:t>Доктор</w:t>
+      </w:r>
+      <w:proofErr w:type="spellEnd"/>
       <w:r>
         <w:rPr>
           <w:rStyle w:val="StrongEmphasis"/>
         </w:rPr>
-        <w:t>Mozyrska</w:t>
-      </w:r>
-      <w:proofErr w:type="spellEnd"/>
+        <w:t xml:space="preserve"> </w:t>
+      </w:r>
+      <w:proofErr w:type="spellStart"/>
       <w:r>
         <w:rPr>
           <w:rStyle w:val="StrongEmphasis"/>
         </w:rPr>
-        <w:t>, Prof. PB</w:t>
+        <w:t>Дорота</w:t>
+      </w:r>
+      <w:proofErr w:type="spellEnd"/>
+      <w:r>
+        <w:rPr>
+          <w:rStyle w:val="StrongEmphasis"/>
+        </w:rPr>
+        <w:t xml:space="preserve"> </w:t>
+      </w:r>
+      <w:proofErr w:type="spellStart"/>
+      <w:r>
+        <w:rPr>
+          <w:rStyle w:val="StrongEmphasis"/>
+        </w:rPr>
+        <w:t>Мозийская</w:t>
+      </w:r>
+      <w:proofErr w:type="spellEnd"/>
+      <w:r>
+        <w:rPr>
+          <w:rStyle w:val="StrongEmphasis"/>
+        </w:rPr>
+        <w:t xml:space="preserve">, </w:t>
+      </w:r>
+      <w:proofErr w:type="spellStart"/>
+      <w:r>
+        <w:rPr>
+          <w:rStyle w:val="StrongEmphasis"/>
+        </w:rPr>
+        <w:t>профессор</w:t>
+      </w:r>
+      <w:proofErr w:type="spellEnd"/>
+      <w:r>
+        <w:rPr>
+          <w:rStyle w:val="StrongEmphasis"/>
+        </w:rPr>
+        <w:t xml:space="preserve"> П.Б.</w:t>
       </w:r>
     </w:p>
     <w:p>
@@ -620,11 +720,10 @@
       </w:pPr>
       <w:r>
         <w:tab/>
-        <w:t xml:space="preserve">I </w:t>
-      </w:r>
-      <w:proofErr w:type="spellStart"/>
-      <w:r>
-        <w:t>ask</w:t>
+      </w:r>
+      <w:proofErr w:type="spellStart"/>
+      <w:r>
+        <w:t>Прошу</w:t>
       </w:r>
       <w:proofErr w:type="spellEnd"/>
       <w:r>
@@ -632,39 +731,7 @@
       </w:r>
       <w:proofErr w:type="spellStart"/>
       <w:r>
-        <w:t>that</w:t>
-      </w:r>
-      <w:proofErr w:type="spellEnd"/>
-      <w:r>
-        <w:t xml:space="preserve"> student </w:t>
-      </w:r>
-      <w:proofErr w:type="spellStart"/>
-      <w:r>
-        <w:t>practice</w:t>
-      </w:r>
-      <w:proofErr w:type="spellEnd"/>
-      <w:r>
-        <w:t xml:space="preserve"> be </w:t>
-      </w:r>
-      <w:proofErr w:type="spellStart"/>
-      <w:r>
-        <w:t>credited</w:t>
-      </w:r>
-      <w:proofErr w:type="spellEnd"/>
-      <w:r>
-        <w:t xml:space="preserve"> on the </w:t>
-      </w:r>
-      <w:proofErr w:type="spellStart"/>
-      <w:r>
-        <w:t>basis</w:t>
-      </w:r>
-      <w:proofErr w:type="spellEnd"/>
-      <w:r>
-        <w:t xml:space="preserve"> of </w:t>
-      </w:r>
-      <w:proofErr w:type="spellStart"/>
-      <w:r>
-        <w:t>professional</w:t>
+        <w:t>вас</w:t>
       </w:r>
       <w:proofErr w:type="spellEnd"/>
       <w:r>
@@ -672,7 +739,7 @@
       </w:r>
       <w:proofErr w:type="spellStart"/>
       <w:r>
-        <w:t>experience</w:t>
+        <w:t>получить</w:t>
       </w:r>
       <w:proofErr w:type="spellEnd"/>
       <w:r>
@@ -680,7 +747,7 @@
       </w:r>
       <w:proofErr w:type="spellStart"/>
       <w:r>
-        <w:t>gained</w:t>
+        <w:t>степень</w:t>
       </w:r>
       <w:proofErr w:type="spellEnd"/>
       <w:r>
@@ -688,19 +755,67 @@
       </w:r>
       <w:proofErr w:type="spellStart"/>
       <w:r>
-        <w:t>at</w:t>
-      </w:r>
-      <w:proofErr w:type="spellEnd"/>
-      <w:r>
-        <w:t xml:space="preserve"> the </w:t>
-      </w:r>
-      <w:proofErr w:type="spellStart"/>
-      <w:r>
-        <w:t>company</w:t>
-      </w:r>
-      <w:proofErr w:type="spellEnd"/>
-      <w:r>
-        <w:t xml:space="preserve"> ..................................................................................................................................................................... </w:t>
+        <w:t>студенческой</w:t>
+      </w:r>
+      <w:proofErr w:type="spellEnd"/>
+      <w:r>
+        <w:t xml:space="preserve"> </w:t>
+      </w:r>
+      <w:proofErr w:type="spellStart"/>
+      <w:r>
+        <w:t>практики</w:t>
+      </w:r>
+      <w:proofErr w:type="spellEnd"/>
+      <w:r>
+        <w:t xml:space="preserve"> </w:t>
+      </w:r>
+      <w:proofErr w:type="spellStart"/>
+      <w:r>
+        <w:t>на</w:t>
+      </w:r>
+      <w:proofErr w:type="spellEnd"/>
+      <w:r>
+        <w:t xml:space="preserve"> </w:t>
+      </w:r>
+      <w:proofErr w:type="spellStart"/>
+      <w:r>
+        <w:t>основе</w:t>
+      </w:r>
+      <w:proofErr w:type="spellEnd"/>
+      <w:r>
+        <w:t xml:space="preserve"> </w:t>
+      </w:r>
+      <w:proofErr w:type="spellStart"/>
+      <w:r>
+        <w:t>профессионального</w:t>
+      </w:r>
+      <w:proofErr w:type="spellEnd"/>
+      <w:r>
+        <w:t xml:space="preserve"> </w:t>
+      </w:r>
+      <w:proofErr w:type="spellStart"/>
+      <w:r>
+        <w:t>опыта</w:t>
+      </w:r>
+      <w:proofErr w:type="spellEnd"/>
+      <w:r>
+        <w:t xml:space="preserve">, </w:t>
+      </w:r>
+      <w:proofErr w:type="spellStart"/>
+      <w:r>
+        <w:t>полученного</w:t>
+      </w:r>
+      <w:proofErr w:type="spellEnd"/>
+      <w:r>
+        <w:t xml:space="preserve"> в </w:t>
+      </w:r>
+      <w:proofErr w:type="spellStart"/>
+      <w:r>
+        <w:t>компании</w:t>
+      </w:r>
+      <w:proofErr w:type="spellEnd"/>
+      <w:r>
+        <w:t xml:space="preserve"> ........................................................................................................... </w:t>
       </w:r>
     </w:p>
     <w:p>
@@ -714,13 +829,401 @@
           <w:lang w:eastAsia="en-US" w:bidi="ar-SA"/>
         </w:rPr>
       </w:pPr>
-      <w:r>
-        <w:rPr>
-          <w:rFonts w:cs="Times New Roman"/>
-          <w:kern w:val="0"/>
-          <w:lang w:eastAsia="en-US" w:bidi="ar-SA"/>
-        </w:rPr>
-        <w:t>.................................................................................................................................................................................................................................................................................................................................................................................................................................................................................................................................................................................................................................................................................................................................................................................................................................................................................................................................................................................................................................................................................................................................................................................................................................................................................................................................................................................................................................................................................................................................................................................................................................................................................................................................................................................................................................................................................................................................................................................................................................................................................................................................................................................................................................................................................................................................................................................................................................................................................................................................................................................................................................................................................................................................................................................................................................................................................................................................................................................................................................................................................................................................................................................................................................................................................................................................................................................................................................................................................................................................................................................................................................................................................................................................................................................................................................................................................................................................................................................................................................................................................................................................................................................................................................</w:t>
+      <w:proofErr w:type="spellStart"/>
+      <w:r>
+        <w:rPr>
+          <w:rFonts w:cs="Times New Roman"/>
+          <w:kern w:val="0"/>
+          <w:lang w:eastAsia="en-US" w:bidi="ar-SA"/>
+        </w:rPr>
+        <w:t>осуществляемого</w:t>
+      </w:r>
+      <w:proofErr w:type="spellEnd"/>
+      <w:r>
+        <w:rPr>
+          <w:rFonts w:cs="Times New Roman"/>
+          <w:kern w:val="0"/>
+          <w:lang w:eastAsia="en-US" w:bidi="ar-SA"/>
+        </w:rPr>
+        <w:t xml:space="preserve"> в </w:t>
+      </w:r>
+      <w:proofErr w:type="spellStart"/>
+      <w:r>
+        <w:rPr>
+          <w:rFonts w:cs="Times New Roman"/>
+          <w:kern w:val="0"/>
+          <w:lang w:eastAsia="en-US" w:bidi="ar-SA"/>
+        </w:rPr>
+        <w:t>рамках</w:t>
+      </w:r>
+      <w:proofErr w:type="spellEnd"/>
+      <w:r>
+        <w:rPr>
+          <w:rFonts w:cs="Times New Roman"/>
+          <w:kern w:val="0"/>
+          <w:lang w:eastAsia="en-US" w:bidi="ar-SA"/>
+        </w:rPr>
+        <w:t xml:space="preserve"> </w:t>
+      </w:r>
+      <w:proofErr w:type="spellStart"/>
+      <w:r>
+        <w:rPr>
+          <w:rFonts w:cs="Times New Roman"/>
+          <w:kern w:val="0"/>
+          <w:lang w:eastAsia="en-US" w:bidi="ar-SA"/>
+        </w:rPr>
+        <w:t>договора</w:t>
+      </w:r>
+      <w:proofErr w:type="spellEnd"/>
+      <w:r>
+        <w:rPr>
+          <w:rFonts w:cs="Times New Roman"/>
+          <w:kern w:val="0"/>
+          <w:lang w:eastAsia="en-US" w:bidi="ar-SA"/>
+        </w:rPr>
+        <w:t xml:space="preserve"> ................................................................................................................................................... , </w:t>
+      </w:r>
+      <w:proofErr w:type="spellStart"/>
+      <w:r>
+        <w:rPr>
+          <w:rFonts w:cs="Times New Roman"/>
+          <w:kern w:val="0"/>
+          <w:lang w:eastAsia="en-US" w:bidi="ar-SA"/>
+        </w:rPr>
+        <w:t>под</w:t>
+      </w:r>
+      <w:proofErr w:type="spellEnd"/>
+      <w:r>
+        <w:rPr>
+          <w:rFonts w:cs="Times New Roman"/>
+          <w:kern w:val="0"/>
+          <w:lang w:eastAsia="en-US" w:bidi="ar-SA"/>
+        </w:rPr>
+        <w:t xml:space="preserve"> </w:t>
+      </w:r>
+      <w:proofErr w:type="spellStart"/>
+      <w:r>
+        <w:rPr>
+          <w:rFonts w:cs="Times New Roman"/>
+          <w:kern w:val="0"/>
+          <w:lang w:eastAsia="en-US" w:bidi="ar-SA"/>
+        </w:rPr>
+        <w:t>руководством</w:t>
+      </w:r>
+      <w:proofErr w:type="spellEnd"/>
+      <w:r>
+        <w:rPr>
+          <w:rFonts w:cs="Times New Roman"/>
+          <w:kern w:val="0"/>
+          <w:lang w:eastAsia="en-US" w:bidi="ar-SA"/>
+        </w:rPr>
+        <w:t xml:space="preserve"> ........................................................................................................................... , в </w:t>
+      </w:r>
+      <w:proofErr w:type="spellStart"/>
+      <w:r>
+        <w:rPr>
+          <w:rFonts w:cs="Times New Roman"/>
+          <w:kern w:val="0"/>
+          <w:lang w:eastAsia="en-US" w:bidi="ar-SA"/>
+        </w:rPr>
+        <w:t>период</w:t>
+      </w:r>
+      <w:proofErr w:type="spellEnd"/>
+      <w:r>
+        <w:rPr>
+          <w:rFonts w:cs="Times New Roman"/>
+          <w:kern w:val="0"/>
+          <w:lang w:eastAsia="en-US" w:bidi="ar-SA"/>
+        </w:rPr>
+        <w:t xml:space="preserve"> с ................................................... ... , в </w:t>
+      </w:r>
+      <w:proofErr w:type="spellStart"/>
+      <w:r>
+        <w:rPr>
+          <w:rFonts w:cs="Times New Roman"/>
+          <w:kern w:val="0"/>
+          <w:lang w:eastAsia="en-US" w:bidi="ar-SA"/>
+        </w:rPr>
+        <w:t>период</w:t>
+      </w:r>
+      <w:proofErr w:type="spellEnd"/>
+      <w:r>
+        <w:rPr>
+          <w:rFonts w:cs="Times New Roman"/>
+          <w:kern w:val="0"/>
+          <w:lang w:eastAsia="en-US" w:bidi="ar-SA"/>
+        </w:rPr>
+        <w:t xml:space="preserve"> с ........................................... ... , в </w:t>
+      </w:r>
+      <w:proofErr w:type="spellStart"/>
+      <w:r>
+        <w:rPr>
+          <w:rFonts w:cs="Times New Roman"/>
+          <w:kern w:val="0"/>
+          <w:lang w:eastAsia="en-US" w:bidi="ar-SA"/>
+        </w:rPr>
+        <w:t>период</w:t>
+      </w:r>
+      <w:proofErr w:type="spellEnd"/>
+      <w:r>
+        <w:rPr>
+          <w:rFonts w:cs="Times New Roman"/>
+          <w:kern w:val="0"/>
+          <w:lang w:eastAsia="en-US" w:bidi="ar-SA"/>
+        </w:rPr>
+        <w:t xml:space="preserve"> с ... ... ... ... ... , в </w:t>
+      </w:r>
+      <w:proofErr w:type="spellStart"/>
+      <w:r>
+        <w:rPr>
+          <w:rFonts w:cs="Times New Roman"/>
+          <w:kern w:val="0"/>
+          <w:lang w:eastAsia="en-US" w:bidi="ar-SA"/>
+        </w:rPr>
+        <w:t>период</w:t>
+      </w:r>
+      <w:proofErr w:type="spellEnd"/>
+      <w:r>
+        <w:rPr>
+          <w:rFonts w:cs="Times New Roman"/>
+          <w:kern w:val="0"/>
+          <w:lang w:eastAsia="en-US" w:bidi="ar-SA"/>
+        </w:rPr>
+        <w:t xml:space="preserve"> с ... ... ... ... , в </w:t>
+      </w:r>
+      <w:proofErr w:type="spellStart"/>
+      <w:r>
+        <w:rPr>
+          <w:rFonts w:cs="Times New Roman"/>
+          <w:kern w:val="0"/>
+          <w:lang w:eastAsia="en-US" w:bidi="ar-SA"/>
+        </w:rPr>
+        <w:t>период</w:t>
+      </w:r>
+      <w:proofErr w:type="spellEnd"/>
+      <w:r>
+        <w:rPr>
+          <w:rFonts w:cs="Times New Roman"/>
+          <w:kern w:val="0"/>
+          <w:lang w:eastAsia="en-US" w:bidi="ar-SA"/>
+        </w:rPr>
+        <w:t xml:space="preserve"> с ... ... ... , в </w:t>
+      </w:r>
+      <w:proofErr w:type="spellStart"/>
+      <w:r>
+        <w:rPr>
+          <w:rFonts w:cs="Times New Roman"/>
+          <w:kern w:val="0"/>
+          <w:lang w:eastAsia="en-US" w:bidi="ar-SA"/>
+        </w:rPr>
+        <w:t>период</w:t>
+      </w:r>
+      <w:proofErr w:type="spellEnd"/>
+      <w:r>
+        <w:rPr>
+          <w:rFonts w:cs="Times New Roman"/>
+          <w:kern w:val="0"/>
+          <w:lang w:eastAsia="en-US" w:bidi="ar-SA"/>
+        </w:rPr>
+        <w:t xml:space="preserve"> с ... ... , в </w:t>
+      </w:r>
+      <w:proofErr w:type="spellStart"/>
+      <w:r>
+        <w:rPr>
+          <w:rFonts w:cs="Times New Roman"/>
+          <w:kern w:val="0"/>
+          <w:lang w:eastAsia="en-US" w:bidi="ar-SA"/>
+        </w:rPr>
+        <w:t>период</w:t>
+      </w:r>
+      <w:proofErr w:type="spellEnd"/>
+      <w:r>
+        <w:rPr>
+          <w:rFonts w:cs="Times New Roman"/>
+          <w:kern w:val="0"/>
+          <w:lang w:eastAsia="en-US" w:bidi="ar-SA"/>
+        </w:rPr>
+        <w:t xml:space="preserve"> с ... ... , в </w:t>
+      </w:r>
+      <w:proofErr w:type="spellStart"/>
+      <w:r>
+        <w:rPr>
+          <w:rFonts w:cs="Times New Roman"/>
+          <w:kern w:val="0"/>
+          <w:lang w:eastAsia="en-US" w:bidi="ar-SA"/>
+        </w:rPr>
+        <w:t>период</w:t>
+      </w:r>
+      <w:proofErr w:type="spellEnd"/>
+      <w:r>
+        <w:rPr>
+          <w:rFonts w:cs="Times New Roman"/>
+          <w:kern w:val="0"/>
+          <w:lang w:eastAsia="en-US" w:bidi="ar-SA"/>
+        </w:rPr>
+        <w:t xml:space="preserve"> с ... , в </w:t>
+      </w:r>
+      <w:proofErr w:type="spellStart"/>
+      <w:r>
+        <w:rPr>
+          <w:rFonts w:cs="Times New Roman"/>
+          <w:kern w:val="0"/>
+          <w:lang w:eastAsia="en-US" w:bidi="ar-SA"/>
+        </w:rPr>
+        <w:t>период</w:t>
+      </w:r>
+      <w:proofErr w:type="spellEnd"/>
+      <w:r>
+        <w:rPr>
+          <w:rFonts w:cs="Times New Roman"/>
+          <w:kern w:val="0"/>
+          <w:lang w:eastAsia="en-US" w:bidi="ar-SA"/>
+        </w:rPr>
+        <w:t xml:space="preserve"> с ... , в </w:t>
+      </w:r>
+      <w:proofErr w:type="spellStart"/>
+      <w:r>
+        <w:rPr>
+          <w:rFonts w:cs="Times New Roman"/>
+          <w:kern w:val="0"/>
+          <w:lang w:eastAsia="en-US" w:bidi="ar-SA"/>
+        </w:rPr>
+        <w:t>период</w:t>
+      </w:r>
+      <w:proofErr w:type="spellEnd"/>
+      <w:r>
+        <w:rPr>
+          <w:rFonts w:cs="Times New Roman"/>
+          <w:kern w:val="0"/>
+          <w:lang w:eastAsia="en-US" w:bidi="ar-SA"/>
+        </w:rPr>
+        <w:t xml:space="preserve"> с ... , в </w:t>
+      </w:r>
+      <w:proofErr w:type="spellStart"/>
+      <w:r>
+        <w:rPr>
+          <w:rFonts w:cs="Times New Roman"/>
+          <w:kern w:val="0"/>
+          <w:lang w:eastAsia="en-US" w:bidi="ar-SA"/>
+        </w:rPr>
+        <w:t>период</w:t>
+      </w:r>
+      <w:proofErr w:type="spellEnd"/>
+      <w:r>
+        <w:rPr>
+          <w:rFonts w:cs="Times New Roman"/>
+          <w:kern w:val="0"/>
+          <w:lang w:eastAsia="en-US" w:bidi="ar-SA"/>
+        </w:rPr>
+        <w:t xml:space="preserve"> с ... , в </w:t>
+      </w:r>
+      <w:proofErr w:type="spellStart"/>
+      <w:r>
+        <w:rPr>
+          <w:rFonts w:cs="Times New Roman"/>
+          <w:kern w:val="0"/>
+          <w:lang w:eastAsia="en-US" w:bidi="ar-SA"/>
+        </w:rPr>
+        <w:t>период</w:t>
+      </w:r>
+      <w:proofErr w:type="spellEnd"/>
+      <w:r>
+        <w:rPr>
+          <w:rFonts w:cs="Times New Roman"/>
+          <w:kern w:val="0"/>
+          <w:lang w:eastAsia="en-US" w:bidi="ar-SA"/>
+        </w:rPr>
+        <w:t xml:space="preserve"> с ... , в </w:t>
+      </w:r>
+      <w:proofErr w:type="spellStart"/>
+      <w:r>
+        <w:rPr>
+          <w:rFonts w:cs="Times New Roman"/>
+          <w:kern w:val="0"/>
+          <w:lang w:eastAsia="en-US" w:bidi="ar-SA"/>
+        </w:rPr>
+        <w:t>период</w:t>
+      </w:r>
+      <w:proofErr w:type="spellEnd"/>
+      <w:r>
+        <w:rPr>
+          <w:rFonts w:cs="Times New Roman"/>
+          <w:kern w:val="0"/>
+          <w:lang w:eastAsia="en-US" w:bidi="ar-SA"/>
+        </w:rPr>
+        <w:t xml:space="preserve"> с ... , в </w:t>
+      </w:r>
+      <w:proofErr w:type="spellStart"/>
+      <w:r>
+        <w:rPr>
+          <w:rFonts w:cs="Times New Roman"/>
+          <w:kern w:val="0"/>
+          <w:lang w:eastAsia="en-US" w:bidi="ar-SA"/>
+        </w:rPr>
+        <w:t>период</w:t>
+      </w:r>
+      <w:proofErr w:type="spellEnd"/>
+      <w:r>
+        <w:rPr>
+          <w:rFonts w:cs="Times New Roman"/>
+          <w:kern w:val="0"/>
+          <w:lang w:eastAsia="en-US" w:bidi="ar-SA"/>
+        </w:rPr>
+        <w:t xml:space="preserve"> с ... , в </w:t>
+      </w:r>
+      <w:proofErr w:type="spellStart"/>
+      <w:r>
+        <w:rPr>
+          <w:rFonts w:cs="Times New Roman"/>
+          <w:kern w:val="0"/>
+          <w:lang w:eastAsia="en-US" w:bidi="ar-SA"/>
+        </w:rPr>
+        <w:t>период</w:t>
+      </w:r>
+      <w:proofErr w:type="spellEnd"/>
+      <w:r>
+        <w:rPr>
+          <w:rFonts w:cs="Times New Roman"/>
+          <w:kern w:val="0"/>
+          <w:lang w:eastAsia="en-US" w:bidi="ar-SA"/>
+        </w:rPr>
+        <w:t xml:space="preserve"> с ... , в </w:t>
+      </w:r>
+      <w:proofErr w:type="spellStart"/>
+      <w:r>
+        <w:rPr>
+          <w:rFonts w:cs="Times New Roman"/>
+          <w:kern w:val="0"/>
+          <w:lang w:eastAsia="en-US" w:bidi="ar-SA"/>
+        </w:rPr>
+        <w:t>период</w:t>
+      </w:r>
+      <w:proofErr w:type="spellEnd"/>
+      <w:r>
+        <w:rPr>
+          <w:rFonts w:cs="Times New Roman"/>
+          <w:kern w:val="0"/>
+          <w:lang w:eastAsia="en-US" w:bidi="ar-SA"/>
+        </w:rPr>
+        <w:t xml:space="preserve"> с ... , в </w:t>
+      </w:r>
+      <w:proofErr w:type="spellStart"/>
+      <w:r>
+        <w:rPr>
+          <w:rFonts w:cs="Times New Roman"/>
+          <w:kern w:val="0"/>
+          <w:lang w:eastAsia="en-US" w:bidi="ar-SA"/>
+        </w:rPr>
+        <w:t>период</w:t>
+      </w:r>
+      <w:proofErr w:type="spellEnd"/>
+      <w:r>
+        <w:rPr>
+          <w:rFonts w:cs="Times New Roman"/>
+          <w:kern w:val="0"/>
+          <w:lang w:eastAsia="en-US" w:bidi="ar-SA"/>
+        </w:rPr>
+        <w:t xml:space="preserve"> с ...</w:t>
       </w:r>
     </w:p>
     <w:p>
@@ -743,35 +1246,7 @@
         <w:rPr>
           <w:rFonts w:cs="Times New Roman"/>
         </w:rPr>
-        <w:t>Description</w:t>
-      </w:r>
-      <w:proofErr w:type="spellEnd"/>
-      <w:r>
-        <w:rPr>
-          <w:rFonts w:cs="Times New Roman"/>
-        </w:rPr>
-        <w:t xml:space="preserve"> of the </w:t>
-      </w:r>
-      <w:proofErr w:type="spellStart"/>
-      <w:r>
-        <w:rPr>
-          <w:rFonts w:cs="Times New Roman"/>
-        </w:rPr>
-        <w:t>work</w:t>
-      </w:r>
-      <w:proofErr w:type="spellEnd"/>
-      <w:r>
-        <w:rPr>
-          <w:rFonts w:cs="Times New Roman"/>
-        </w:rPr>
-        <w:t xml:space="preserve"> and </w:t>
-      </w:r>
-      <w:proofErr w:type="spellStart"/>
-      <w:r>
-        <w:rPr>
-          <w:rFonts w:cs="Times New Roman"/>
-        </w:rPr>
-        <w:t>its</w:t>
+        <w:t>Описание</w:t>
       </w:r>
       <w:proofErr w:type="spellEnd"/>
       <w:r>
@@ -785,21 +1260,21 @@
         <w:rPr>
           <w:rFonts w:cs="Times New Roman"/>
         </w:rPr>
-        <w:t>relationship</w:t>
-      </w:r>
-      <w:proofErr w:type="spellEnd"/>
-      <w:r>
-        <w:rPr>
-          <w:rFonts w:cs="Times New Roman"/>
-        </w:rPr>
-        <w:t xml:space="preserve"> with the </w:t>
-      </w:r>
-      <w:proofErr w:type="spellStart"/>
-      <w:r>
-        <w:rPr>
-          <w:rFonts w:cs="Times New Roman"/>
-        </w:rPr>
-        <w:t>study</w:t>
+        <w:t>работы</w:t>
+      </w:r>
+      <w:proofErr w:type="spellEnd"/>
+      <w:r>
+        <w:rPr>
+          <w:rFonts w:cs="Times New Roman"/>
+        </w:rPr>
+        <w:t xml:space="preserve"> и </w:t>
+      </w:r>
+      <w:proofErr w:type="spellStart"/>
+      <w:r>
+        <w:rPr>
+          <w:rFonts w:cs="Times New Roman"/>
+        </w:rPr>
+        <w:t>ее</w:t>
       </w:r>
       <w:proofErr w:type="spellEnd"/>
       <w:r>
@@ -813,35 +1288,63 @@
         <w:rPr>
           <w:rFonts w:cs="Times New Roman"/>
         </w:rPr>
-        <w:t>programme</w:t>
-      </w:r>
-      <w:proofErr w:type="spellEnd"/>
-      <w:r>
-        <w:rPr>
-          <w:rFonts w:cs="Times New Roman"/>
-        </w:rPr>
-        <w:t xml:space="preserve"> and the </w:t>
-      </w:r>
-      <w:proofErr w:type="spellStart"/>
-      <w:r>
-        <w:rPr>
-          <w:rFonts w:cs="Times New Roman"/>
-        </w:rPr>
-        <w:t>photocopy</w:t>
-      </w:r>
-      <w:proofErr w:type="spellEnd"/>
-      <w:r>
-        <w:rPr>
-          <w:rFonts w:cs="Times New Roman"/>
-        </w:rPr>
-        <w:t xml:space="preserve"> of the </w:t>
-      </w:r>
-      <w:proofErr w:type="spellStart"/>
-      <w:r>
-        <w:rPr>
-          <w:rFonts w:cs="Times New Roman"/>
-        </w:rPr>
-        <w:t>contract</w:t>
+        <w:t>связь</w:t>
+      </w:r>
+      <w:proofErr w:type="spellEnd"/>
+      <w:r>
+        <w:rPr>
+          <w:rFonts w:cs="Times New Roman"/>
+        </w:rPr>
+        <w:t xml:space="preserve"> с </w:t>
+      </w:r>
+      <w:proofErr w:type="spellStart"/>
+      <w:r>
+        <w:rPr>
+          <w:rFonts w:cs="Times New Roman"/>
+        </w:rPr>
+        <w:t>программой</w:t>
+      </w:r>
+      <w:proofErr w:type="spellEnd"/>
+      <w:r>
+        <w:rPr>
+          <w:rFonts w:cs="Times New Roman"/>
+        </w:rPr>
+        <w:t xml:space="preserve"> </w:t>
+      </w:r>
+      <w:proofErr w:type="spellStart"/>
+      <w:r>
+        <w:rPr>
+          <w:rFonts w:cs="Times New Roman"/>
+        </w:rPr>
+        <w:t>обучения</w:t>
+      </w:r>
+      <w:proofErr w:type="spellEnd"/>
+      <w:r>
+        <w:rPr>
+          <w:rFonts w:cs="Times New Roman"/>
+        </w:rPr>
+        <w:t xml:space="preserve"> и </w:t>
+      </w:r>
+      <w:proofErr w:type="spellStart"/>
+      <w:r>
+        <w:rPr>
+          <w:rFonts w:cs="Times New Roman"/>
+        </w:rPr>
+        <w:t>ксерокопия</w:t>
+      </w:r>
+      <w:proofErr w:type="spellEnd"/>
+      <w:r>
+        <w:rPr>
+          <w:rFonts w:cs="Times New Roman"/>
+        </w:rPr>
+        <w:t xml:space="preserve"> </w:t>
+      </w:r>
+      <w:proofErr w:type="spellStart"/>
+      <w:r>
+        <w:rPr>
+          <w:rFonts w:cs="Times New Roman"/>
+        </w:rPr>
+        <w:t>договора</w:t>
       </w:r>
       <w:proofErr w:type="spellEnd"/>
       <w:r>
@@ -855,7 +1358,21 @@
         <w:rPr>
           <w:rFonts w:cs="Times New Roman"/>
         </w:rPr>
-        <w:t>professional</w:t>
+        <w:t>справка</w:t>
+      </w:r>
+      <w:proofErr w:type="spellEnd"/>
+      <w:r>
+        <w:rPr>
+          <w:rFonts w:cs="Times New Roman"/>
+        </w:rPr>
+        <w:t xml:space="preserve"> о </w:t>
+      </w:r>
+      <w:proofErr w:type="spellStart"/>
+      <w:r>
+        <w:rPr>
+          <w:rFonts w:cs="Times New Roman"/>
+        </w:rPr>
+        <w:t>прохождении</w:t>
       </w:r>
       <w:proofErr w:type="spellEnd"/>
       <w:r>
@@ -869,7 +1386,7 @@
         <w:rPr>
           <w:rFonts w:cs="Times New Roman"/>
         </w:rPr>
-        <w:t>training</w:t>
+        <w:t>профессиональной</w:t>
       </w:r>
       <w:proofErr w:type="spellEnd"/>
       <w:r>
@@ -883,21 +1400,21 @@
         <w:rPr>
           <w:rFonts w:cs="Times New Roman"/>
         </w:rPr>
-        <w:t>certificate</w:t>
-      </w:r>
-      <w:proofErr w:type="spellEnd"/>
-      <w:r>
-        <w:rPr>
-          <w:rFonts w:cs="Times New Roman"/>
-        </w:rPr>
-        <w:t xml:space="preserve">) in the </w:t>
-      </w:r>
-      <w:proofErr w:type="spellStart"/>
-      <w:r>
-        <w:rPr>
-          <w:rFonts w:cs="Times New Roman"/>
-        </w:rPr>
-        <w:t>attached</w:t>
+        <w:t>практики</w:t>
+      </w:r>
+      <w:proofErr w:type="spellEnd"/>
+      <w:r>
+        <w:rPr>
+          <w:rFonts w:cs="Times New Roman"/>
+        </w:rPr>
+        <w:t xml:space="preserve">) в </w:t>
+      </w:r>
+      <w:proofErr w:type="spellStart"/>
+      <w:r>
+        <w:rPr>
+          <w:rFonts w:cs="Times New Roman"/>
+        </w:rPr>
+        <w:t>приложенных</w:t>
       </w:r>
       <w:proofErr w:type="spellEnd"/>
       <w:r>
@@ -911,7 +1428,7 @@
         <w:rPr>
           <w:rFonts w:cs="Times New Roman"/>
         </w:rPr>
-        <w:t>annexes</w:t>
+        <w:t>приложениях</w:t>
       </w:r>
       <w:proofErr w:type="spellEnd"/>
       <w:r>
@@ -989,6 +1506,7 @@
           <w:i/>
           <w:sz w:val="16"/>
         </w:rPr>
+        <w:lastRenderedPageBreak/>
         <w:tab/>
       </w:r>
       <w:proofErr w:type="spellStart"/>
@@ -997,7 +1515,7 @@
           <w:i/>
           <w:sz w:val="16"/>
         </w:rPr>
-        <w:t>clear</w:t>
+        <w:t>читаемый</w:t>
       </w:r>
       <w:proofErr w:type="spellEnd"/>
       <w:r>
@@ -1005,7 +1523,7 @@
           <w:i/>
           <w:sz w:val="16"/>
         </w:rPr>
-        <w:t xml:space="preserve"> student </w:t>
+        <w:t xml:space="preserve"> </w:t>
       </w:r>
       <w:proofErr w:type="spellStart"/>
       <w:r>
@@ -1013,7 +1531,23 @@
           <w:i/>
           <w:sz w:val="16"/>
         </w:rPr>
-        <w:t>signature</w:t>
+        <w:t>подпись</w:t>
+      </w:r>
+      <w:proofErr w:type="spellEnd"/>
+      <w:r>
+        <w:rPr>
+          <w:i/>
+          <w:sz w:val="16"/>
+        </w:rPr>
+        <w:t xml:space="preserve"> </w:t>
+      </w:r>
+      <w:proofErr w:type="spellStart"/>
+      <w:r>
+        <w:rPr>
+          <w:i/>
+          <w:sz w:val="16"/>
+        </w:rPr>
+        <w:t>студента</w:t>
       </w:r>
       <w:proofErr w:type="spellEnd"/>
     </w:p>
@@ -1066,7 +1600,7 @@
 </file>
 
 <file path=word/endnotes.xml><?xml version="1.0" encoding="utf-8"?>
-<w:endnotes xmlns:wpc="http://schemas.microsoft.com/office/word/2010/wordprocessingCanvas" xmlns:cx="http://schemas.microsoft.com/office/drawing/2014/chartex" xmlns:cx1="http://schemas.microsoft.com/office/drawing/2015/9/8/chartex" xmlns:cx2="http://schemas.microsoft.com/office/drawing/2015/10/21/chartex" xmlns:cx3="http://schemas.microsoft.com/office/drawing/2016/5/9/chartex" xmlns:cx4="http://schemas.microsoft.com/office/drawing/2016/5/10/chartex" xmlns:cx5="http://schemas.microsoft.com/office/drawing/2016/5/11/chartex" xmlns:cx6="http://schemas.microsoft.com/office/drawing/2016/5/12/chartex" xmlns:cx7="http://schemas.microsoft.com/office/drawing/2016/5/13/chartex" xmlns:cx8="http://schemas.microsoft.com/office/drawing/2016/5/14/chartex" xmlns:mc="http://schemas.openxmlformats.org/markup-compatibility/2006" xmlns:aink="http://schemas.microsoft.com/office/drawing/2016/ink" xmlns:am3d="http://schemas.microsoft.com/office/drawing/2017/model3d" xmlns:o="urn:schemas-microsoft-com:office:office" xmlns:oel="http://schemas.microsoft.com/office/2019/extlst" xmlns:r="http://schemas.openxmlformats.org/officeDocument/2006/relationships" xmlns:m="http://schemas.openxmlformats.org/officeDocument/2006/math" xmlns:v="urn:schemas-microsoft-com:vml" xmlns:wp14="http://schemas.microsoft.com/office/word/2010/wordprocessingDrawing" xmlns:wp="http://schemas.openxmlformats.org/drawingml/2006/wordprocessingDrawing" xmlns:w10="urn:schemas-microsoft-com:office:word" xmlns:w="http://schemas.openxmlformats.org/wordprocessingml/2006/main" xmlns:w14="http://schemas.microsoft.com/office/word/2010/wordml" xmlns:w15="http://schemas.microsoft.com/office/word/2012/wordml" xmlns:w16cex="http://schemas.microsoft.com/office/word/2018/wordml/cex" xmlns:w16cid="http://schemas.microsoft.com/office/word/2016/wordml/cid" xmlns:w16="http://schemas.microsoft.com/office/word/2018/wordml" xmlns:w16du="http://schemas.microsoft.com/office/word/2023/wordml/word16du" xmlns:w16sdtdh="http://schemas.microsoft.com/office/word/2020/wordml/sdtdatahash" xmlns:w16sdtfl="http://schemas.microsoft.com/office/word/2024/wordml/sdtformatlock" xmlns:w16se="http://schemas.microsoft.com/office/word/2015/wordml/symex" xmlns:wpg="http://schemas.microsoft.com/office/word/2010/wordprocessingGroup" xmlns:wpi="http://schemas.microsoft.com/office/word/2010/wordprocessingInk" xmlns:wne="http://schemas.microsoft.com/office/word/2006/wordml" xmlns:wps="http://schemas.microsoft.com/office/word/2010/wordprocessingShape" mc:Ignorable="w14 w15 w16se w16cid w16 w16cex w16sdtdh w16sdtfl w16du wp14">
+<w:endnotes xmlns:wpc="http://schemas.microsoft.com/office/word/2010/wordprocessingCanvas" xmlns:mc="http://schemas.openxmlformats.org/markup-compatibility/2006" xmlns:o="urn:schemas-microsoft-com:office:office" xmlns:r="http://schemas.openxmlformats.org/officeDocument/2006/relationships" xmlns:m="http://schemas.openxmlformats.org/officeDocument/2006/math" xmlns:v="urn:schemas-microsoft-com:vml" xmlns:wp14="http://schemas.microsoft.com/office/word/2010/wordprocessingDrawing" xmlns:wp="http://schemas.openxmlformats.org/drawingml/2006/wordprocessingDrawing" xmlns:w10="urn:schemas-microsoft-com:office:word" xmlns:w="http://schemas.openxmlformats.org/wordprocessingml/2006/main" xmlns:w14="http://schemas.microsoft.com/office/word/2010/wordml" xmlns:w15="http://schemas.microsoft.com/office/word/2012/wordml" xmlns:wpg="http://schemas.microsoft.com/office/word/2010/wordprocessingGroup" xmlns:wpi="http://schemas.microsoft.com/office/word/2010/wordprocessingInk" xmlns:wne="http://schemas.microsoft.com/office/word/2006/wordml" xmlns:wps="http://schemas.microsoft.com/office/word/2010/wordprocessingShape" mc:Ignorable="w14 w15 wp14">
   <w:endnote w:type="separator" w:id="-1">
     <w:p>
       <w:r>
@@ -1085,7 +1619,7 @@
 </file>
 
 <file path=word/footnotes.xml><?xml version="1.0" encoding="utf-8"?>
-<w:footnotes xmlns:wpc="http://schemas.microsoft.com/office/word/2010/wordprocessingCanvas" xmlns:cx="http://schemas.microsoft.com/office/drawing/2014/chartex" xmlns:cx1="http://schemas.microsoft.com/office/drawing/2015/9/8/chartex" xmlns:cx2="http://schemas.microsoft.com/office/drawing/2015/10/21/chartex" xmlns:cx3="http://schemas.microsoft.com/office/drawing/2016/5/9/chartex" xmlns:cx4="http://schemas.microsoft.com/office/drawing/2016/5/10/chartex" xmlns:cx5="http://schemas.microsoft.com/office/drawing/2016/5/11/chartex" xmlns:cx6="http://schemas.microsoft.com/office/drawing/2016/5/12/chartex" xmlns:cx7="http://schemas.microsoft.com/office/drawing/2016/5/13/chartex" xmlns:cx8="http://schemas.microsoft.com/office/drawing/2016/5/14/chartex" xmlns:mc="http://schemas.openxmlformats.org/markup-compatibility/2006" xmlns:aink="http://schemas.microsoft.com/office/drawing/2016/ink" xmlns:am3d="http://schemas.microsoft.com/office/drawing/2017/model3d" xmlns:o="urn:schemas-microsoft-com:office:office" xmlns:oel="http://schemas.microsoft.com/office/2019/extlst" xmlns:r="http://schemas.openxmlformats.org/officeDocument/2006/relationships" xmlns:m="http://schemas.openxmlformats.org/officeDocument/2006/math" xmlns:v="urn:schemas-microsoft-com:vml" xmlns:wp14="http://schemas.microsoft.com/office/word/2010/wordprocessingDrawing" xmlns:wp="http://schemas.openxmlformats.org/drawingml/2006/wordprocessingDrawing" xmlns:w10="urn:schemas-microsoft-com:office:word" xmlns:w="http://schemas.openxmlformats.org/wordprocessingml/2006/main" xmlns:w14="http://schemas.microsoft.com/office/word/2010/wordml" xmlns:w15="http://schemas.microsoft.com/office/word/2012/wordml" xmlns:w16cex="http://schemas.microsoft.com/office/word/2018/wordml/cex" xmlns:w16cid="http://schemas.microsoft.com/office/word/2016/wordml/cid" xmlns:w16="http://schemas.microsoft.com/office/word/2018/wordml" xmlns:w16du="http://schemas.microsoft.com/office/word/2023/wordml/word16du" xmlns:w16sdtdh="http://schemas.microsoft.com/office/word/2020/wordml/sdtdatahash" xmlns:w16sdtfl="http://schemas.microsoft.com/office/word/2024/wordml/sdtformatlock" xmlns:w16se="http://schemas.microsoft.com/office/word/2015/wordml/symex" xmlns:wpg="http://schemas.microsoft.com/office/word/2010/wordprocessingGroup" xmlns:wpi="http://schemas.microsoft.com/office/word/2010/wordprocessingInk" xmlns:wne="http://schemas.microsoft.com/office/word/2006/wordml" xmlns:wps="http://schemas.microsoft.com/office/word/2010/wordprocessingShape" mc:Ignorable="w14 w15 w16se w16cid w16 w16cex w16sdtdh w16sdtfl w16du wp14">
+<w:footnotes xmlns:wpc="http://schemas.microsoft.com/office/word/2010/wordprocessingCanvas" xmlns:mc="http://schemas.openxmlformats.org/markup-compatibility/2006" xmlns:o="urn:schemas-microsoft-com:office:office" xmlns:r="http://schemas.openxmlformats.org/officeDocument/2006/relationships" xmlns:m="http://schemas.openxmlformats.org/officeDocument/2006/math" xmlns:v="urn:schemas-microsoft-com:vml" xmlns:wp14="http://schemas.microsoft.com/office/word/2010/wordprocessingDrawing" xmlns:wp="http://schemas.openxmlformats.org/drawingml/2006/wordprocessingDrawing" xmlns:w10="urn:schemas-microsoft-com:office:word" xmlns:w="http://schemas.openxmlformats.org/wordprocessingml/2006/main" xmlns:w14="http://schemas.microsoft.com/office/word/2010/wordml" xmlns:w15="http://schemas.microsoft.com/office/word/2012/wordml" xmlns:wpg="http://schemas.microsoft.com/office/word/2010/wordprocessingGroup" xmlns:wpi="http://schemas.microsoft.com/office/word/2010/wordprocessingInk" xmlns:wne="http://schemas.microsoft.com/office/word/2006/wordml" xmlns:wps="http://schemas.microsoft.com/office/word/2010/wordprocessingShape" mc:Ignorable="w14 w15 wp14">
   <w:footnote w:type="separator" w:id="-1">
     <w:p>
       <w:r>
@@ -1107,7 +1641,7 @@
 </file>
 
 <file path=word/styles.xml><?xml version="1.0" encoding="utf-8"?>
-<w:styles xmlns:mc="http://schemas.openxmlformats.org/markup-compatibility/2006" xmlns:r="http://schemas.openxmlformats.org/officeDocument/2006/relationships" xmlns:w="http://schemas.openxmlformats.org/wordprocessingml/2006/main" xmlns:w14="http://schemas.microsoft.com/office/word/2010/wordml" xmlns:w15="http://schemas.microsoft.com/office/word/2012/wordml" xmlns:w16cex="http://schemas.microsoft.com/office/word/2018/wordml/cex" xmlns:w16cid="http://schemas.microsoft.com/office/word/2016/wordml/cid" xmlns:w16="http://schemas.microsoft.com/office/word/2018/wordml" xmlns:w16du="http://schemas.microsoft.com/office/word/2023/wordml/word16du" xmlns:w16sdtdh="http://schemas.microsoft.com/office/word/2020/wordml/sdtdatahash" xmlns:w16sdtfl="http://schemas.microsoft.com/office/word/2024/wordml/sdtformatlock" xmlns:w16se="http://schemas.microsoft.com/office/word/2015/wordml/symex" mc:Ignorable="w14 w15 w16se w16cid w16 w16cex w16sdtdh w16sdtfl w16du">
+<w:styles xmlns:mc="http://schemas.openxmlformats.org/markup-compatibility/2006" xmlns:r="http://schemas.openxmlformats.org/officeDocument/2006/relationships" xmlns:w="http://schemas.openxmlformats.org/wordprocessingml/2006/main" xmlns:w14="http://schemas.microsoft.com/office/word/2010/wordml" xmlns:w15="http://schemas.microsoft.com/office/word/2012/wordml" mc:Ignorable="w14 w15">
   <w:docDefaults>
     <w:rPrDefault>
       <w:rPr>
@@ -1126,7 +1660,7 @@
       </w:pPr>
     </w:pPrDefault>
   </w:docDefaults>
-  <w:latentStyles w:defLockedState="0" w:defUIPriority="99" w:defSemiHidden="0" w:defUnhideWhenUsed="0" w:defQFormat="0" w:count="376">
+  <w:latentStyles w:defLockedState="0" w:defUIPriority="99" w:defSemiHidden="0" w:defUnhideWhenUsed="0" w:defQFormat="0" w:count="371">
     <w:lsdException w:name="Normal" w:uiPriority="0" w:qFormat="1"/>
     <w:lsdException w:name="heading 1" w:uiPriority="9" w:qFormat="1"/>
     <w:lsdException w:name="heading 2" w:semiHidden="1" w:uiPriority="9" w:unhideWhenUsed="1" w:qFormat="1"/>
@@ -1498,15 +2032,9 @@
     <w:lsdException w:name="List Table 5 Dark Accent 6" w:uiPriority="50"/>
     <w:lsdException w:name="List Table 6 Colorful Accent 6" w:uiPriority="51"/>
     <w:lsdException w:name="List Table 7 Colorful Accent 6" w:uiPriority="52"/>
-    <w:lsdException w:name="Mention" w:semiHidden="1" w:unhideWhenUsed="1"/>
-    <w:lsdException w:name="Smart Hyperlink" w:semiHidden="1" w:unhideWhenUsed="1"/>
-    <w:lsdException w:name="Hashtag" w:semiHidden="1" w:unhideWhenUsed="1"/>
-    <w:lsdException w:name="Unresolved Mention" w:semiHidden="1" w:unhideWhenUsed="1"/>
-    <w:lsdException w:name="Smart Link" w:semiHidden="1" w:unhideWhenUsed="1"/>
   </w:latentStyles>
   <w:style w:type="paragraph" w:default="1" w:styleId="Normalny">
     <w:name w:val="Normal"/>
-    <w:qFormat/>
     <w:pPr>
       <w:suppressAutoHyphens/>
     </w:pPr>
@@ -1679,44 +2207,44 @@
         <a:sysClr val="window" lastClr="FFFFFF"/>
       </a:lt1>
       <a:dk2>
-        <a:srgbClr val="0E2841"/>
+        <a:srgbClr val="44546A"/>
       </a:dk2>
       <a:lt2>
-        <a:srgbClr val="E8E8E8"/>
+        <a:srgbClr val="E7E6E6"/>
       </a:lt2>
       <a:accent1>
-        <a:srgbClr val="156082"/>
+        <a:srgbClr val="5B9BD5"/>
       </a:accent1>
       <a:accent2>
-        <a:srgbClr val="E97132"/>
+        <a:srgbClr val="ED7D31"/>
       </a:accent2>
       <a:accent3>
-        <a:srgbClr val="196B24"/>
+        <a:srgbClr val="A5A5A5"/>
       </a:accent3>
       <a:accent4>
-        <a:srgbClr val="0F9ED5"/>
+        <a:srgbClr val="FFC000"/>
       </a:accent4>
       <a:accent5>
-        <a:srgbClr val="A02B93"/>
+        <a:srgbClr val="4472C4"/>
       </a:accent5>
       <a:accent6>
-        <a:srgbClr val="4EA72E"/>
+        <a:srgbClr val="70AD47"/>
       </a:accent6>
       <a:hlink>
-        <a:srgbClr val="467886"/>
+        <a:srgbClr val="0563C1"/>
       </a:hlink>
       <a:folHlink>
-        <a:srgbClr val="96607D"/>
+        <a:srgbClr val="954F72"/>
       </a:folHlink>
     </a:clrScheme>
     <a:fontScheme name="Pakiet Office">
       <a:majorFont>
-        <a:latin typeface="Aptos Display" panose="02110004020202020204"/>
+        <a:latin typeface="Calibri Light" panose="020F0302020204030204"/>
         <a:ea typeface=""/>
         <a:cs typeface=""/>
-        <a:font script="Jpan" typeface="游ゴシック Light"/>
+        <a:font script="Jpan" typeface="ＭＳ ゴシック"/>
         <a:font script="Hang" typeface="맑은 고딕"/>
-        <a:font script="Hans" typeface="等线 Light"/>
+        <a:font script="Hans" typeface="宋体"/>
         <a:font script="Hant" typeface="新細明體"/>
         <a:font script="Arab" typeface="Times New Roman"/>
         <a:font script="Hebr" typeface="Times New Roman"/>
@@ -1744,31 +2272,14 @@
         <a:font script="Viet" typeface="Times New Roman"/>
         <a:font script="Uigh" typeface="Microsoft Uighur"/>
         <a:font script="Geor" typeface="Sylfaen"/>
-        <a:font script="Armn" typeface="Arial"/>
-        <a:font script="Bugi" typeface="Leelawadee UI"/>
-        <a:font script="Bopo" typeface="Microsoft JhengHei"/>
-        <a:font script="Java" typeface="Javanese Text"/>
-        <a:font script="Lisu" typeface="Segoe UI"/>
-        <a:font script="Mymr" typeface="Myanmar Text"/>
-        <a:font script="Nkoo" typeface="Ebrima"/>
-        <a:font script="Olck" typeface="Nirmala UI"/>
-        <a:font script="Osma" typeface="Ebrima"/>
-        <a:font script="Phag" typeface="Phagspa"/>
-        <a:font script="Syrn" typeface="Estrangelo Edessa"/>
-        <a:font script="Syrj" typeface="Estrangelo Edessa"/>
-        <a:font script="Syre" typeface="Estrangelo Edessa"/>
-        <a:font script="Sora" typeface="Nirmala UI"/>
-        <a:font script="Tale" typeface="Microsoft Tai Le"/>
-        <a:font script="Talu" typeface="Microsoft New Tai Lue"/>
-        <a:font script="Tfng" typeface="Ebrima"/>
       </a:majorFont>
       <a:minorFont>
-        <a:latin typeface="Aptos" panose="02110004020202020204"/>
+        <a:latin typeface="Calibri" panose="020F0502020204030204"/>
         <a:ea typeface=""/>
         <a:cs typeface=""/>
-        <a:font script="Jpan" typeface="游明朝"/>
+        <a:font script="Jpan" typeface="ＭＳ 明朝"/>
         <a:font script="Hang" typeface="맑은 고딕"/>
-        <a:font script="Hans" typeface="等线"/>
+        <a:font script="Hans" typeface="宋体"/>
         <a:font script="Hant" typeface="新細明體"/>
         <a:font script="Arab" typeface="Arial"/>
         <a:font script="Hebr" typeface="Arial"/>
@@ -1796,23 +2307,6 @@
         <a:font script="Viet" typeface="Arial"/>
         <a:font script="Uigh" typeface="Microsoft Uighur"/>
         <a:font script="Geor" typeface="Sylfaen"/>
-        <a:font script="Armn" typeface="Arial"/>
-        <a:font script="Bugi" typeface="Leelawadee UI"/>
-        <a:font script="Bopo" typeface="Microsoft JhengHei"/>
-        <a:font script="Java" typeface="Javanese Text"/>
-        <a:font script="Lisu" typeface="Segoe UI"/>
-        <a:font script="Mymr" typeface="Myanmar Text"/>
-        <a:font script="Nkoo" typeface="Ebrima"/>
-        <a:font script="Olck" typeface="Nirmala UI"/>
-        <a:font script="Osma" typeface="Ebrima"/>
-        <a:font script="Phag" typeface="Phagspa"/>
-        <a:font script="Syrn" typeface="Estrangelo Edessa"/>
-        <a:font script="Syrj" typeface="Estrangelo Edessa"/>
-        <a:font script="Syre" typeface="Estrangelo Edessa"/>
-        <a:font script="Sora" typeface="Nirmala UI"/>
-        <a:font script="Tale" typeface="Microsoft Tai Le"/>
-        <a:font script="Talu" typeface="Microsoft New Tai Lue"/>
-        <a:font script="Tfng" typeface="Ebrima"/>
       </a:minorFont>
     </a:fontScheme>
     <a:fmtScheme name="Pakiet Office">
@@ -1874,6 +2368,13 @@
         </a:gradFill>
       </a:fillStyleLst>
       <a:lnStyleLst>
+        <a:ln w="6350" cap="flat" cmpd="sng" algn="ctr">
+          <a:solidFill>
+            <a:schemeClr val="phClr"/>
+          </a:solidFill>
+          <a:prstDash val="solid"/>
+          <a:miter lim="800000"/>
+        </a:ln>
         <a:ln w="12700" cap="flat" cmpd="sng" algn="ctr">
           <a:solidFill>
             <a:schemeClr val="phClr"/>
@@ -1882,13 +2383,6 @@
           <a:miter lim="800000"/>
         </a:ln>
         <a:ln w="19050" cap="flat" cmpd="sng" algn="ctr">
-          <a:solidFill>
-            <a:schemeClr val="phClr"/>
-          </a:solidFill>
-          <a:prstDash val="solid"/>
-          <a:miter lim="800000"/>
-        </a:ln>
-        <a:ln w="25400" cap="flat" cmpd="sng" algn="ctr">
           <a:solidFill>
             <a:schemeClr val="phClr"/>
           </a:solidFill>
@@ -1953,31 +2447,11 @@
       </a:bgFillStyleLst>
     </a:fmtScheme>
   </a:themeElements>
-  <a:objectDefaults>
-    <a:lnDef>
-      <a:spPr/>
-      <a:bodyPr/>
-      <a:lstStyle/>
-      <a:style>
-        <a:lnRef idx="2">
-          <a:schemeClr val="accent1"/>
-        </a:lnRef>
-        <a:fillRef idx="0">
-          <a:schemeClr val="accent1"/>
-        </a:fillRef>
-        <a:effectRef idx="1">
-          <a:schemeClr val="accent1"/>
-        </a:effectRef>
-        <a:fontRef idx="minor">
-          <a:schemeClr val="tx1"/>
-        </a:fontRef>
-      </a:style>
-    </a:lnDef>
-  </a:objectDefaults>
+  <a:objectDefaults/>
   <a:extraClrSchemeLst/>
   <a:extLst>
     <a:ext uri="{05A4C25C-085E-4340-85A3-A5531E510DB2}">
-      <thm15:themeFamily xmlns:thm15="http://schemas.microsoft.com/office/thememl/2012/main" name="Office Theme" id="{2E142A2C-CD16-42D6-873A-C26D2A0506FA}" vid="{1BDDFF52-6CD6-40A5-AB3C-68EB2F1E4D0A}"/>
+      <thm15:themeFamily xmlns:thm15="http://schemas.microsoft.com/office/thememl/2012/main" name="Office Theme" id="{62F939B6-93AF-4DB8-9C6B-D6C7DFDC589F}" vid="{4A3C46E8-61CC-4603-A589-7422A47A8E4A}"/>
     </a:ext>
   </a:extLst>
 </a:theme>

</xml_diff>